<commit_message>
Team 4: feat: finished 1.6 and most of 1.5
</commit_message>
<xml_diff>
--- a/03_Team_Work/Team4/Milestone_4_Interfaces_and_Data_Structures/Ready/CS_M4_Team4_1.5_AuthenticationService_APIMessages_v01.docx
+++ b/03_Team_Work/Team4/Milestone_4_Interfaces_and_Data_Structures/Ready/CS_M4_Team4_1.5_AuthenticationService_APIMessages_v01.docx
@@ -465,7 +465,25 @@
                 <w:sz w:val="22"/>
                 <w:szCs w:val="22"/>
               </w:rPr>
-              <w:t>Email address used to create and identify the account.</w:t>
+              <w:t xml:space="preserve">Email </w:t>
+            </w:r>
+            <w:proofErr w:type="gramStart"/>
+            <w:r>
+              <w:rPr>
+                <w:rFonts w:ascii="Arial" w:hAnsi="Arial" w:cs="Arial"/>
+                <w:sz w:val="22"/>
+                <w:szCs w:val="22"/>
+              </w:rPr>
+              <w:t>address</w:t>
+            </w:r>
+            <w:proofErr w:type="gramEnd"/>
+            <w:r>
+              <w:rPr>
+                <w:rFonts w:ascii="Arial" w:hAnsi="Arial" w:cs="Arial"/>
+                <w:sz w:val="22"/>
+                <w:szCs w:val="22"/>
+              </w:rPr>
+              <w:t xml:space="preserve"> used to create and identify the account.</w:t>
             </w:r>
           </w:p>
         </w:tc>
@@ -1318,7 +1336,25 @@
                 <w:sz w:val="22"/>
                 <w:szCs w:val="22"/>
               </w:rPr>
-              <w:t>Type of account created, student or company representative.</w:t>
+              <w:t xml:space="preserve">Type of account </w:t>
+            </w:r>
+            <w:proofErr w:type="gramStart"/>
+            <w:r>
+              <w:rPr>
+                <w:rFonts w:ascii="Arial" w:hAnsi="Arial" w:cs="Arial"/>
+                <w:sz w:val="22"/>
+                <w:szCs w:val="22"/>
+              </w:rPr>
+              <w:t>created,</w:t>
+            </w:r>
+            <w:proofErr w:type="gramEnd"/>
+            <w:r>
+              <w:rPr>
+                <w:rFonts w:ascii="Arial" w:hAnsi="Arial" w:cs="Arial"/>
+                <w:sz w:val="22"/>
+                <w:szCs w:val="22"/>
+              </w:rPr>
+              <w:t xml:space="preserve"> student or company representative.</w:t>
             </w:r>
           </w:p>
         </w:tc>
@@ -3239,23 +3275,329 @@
       </w:r>
       <w:proofErr w:type="spellEnd"/>
     </w:p>
-    <w:p>
-      <w:pPr>
-        <w:rPr>
-          <w:rFonts w:ascii="Arial" w:hAnsi="Arial" w:cs="Arial"/>
-          <w:b/>
-          <w:bCs/>
-          <w:sz w:val="27"/>
-          <w:szCs w:val="27"/>
-        </w:rPr>
-      </w:pPr>
-      <w:r>
-        <w:rPr>
-          <w:rFonts w:ascii="Arial" w:hAnsi="Arial" w:cs="Arial"/>
-        </w:rPr>
-        <w:t>[Table Pending]</w:t>
-      </w:r>
-    </w:p>
+    <w:tbl>
+      <w:tblPr>
+        <w:tblStyle w:val="GridTable4"/>
+        <w:tblW w:w="0" w:type="auto"/>
+        <w:tblLook w:val="04A0" w:firstRow="1" w:lastRow="0" w:firstColumn="1" w:lastColumn="0" w:noHBand="0" w:noVBand="1"/>
+      </w:tblPr>
+      <w:tblGrid>
+        <w:gridCol w:w="2482"/>
+        <w:gridCol w:w="2259"/>
+        <w:gridCol w:w="2283"/>
+        <w:gridCol w:w="2326"/>
+      </w:tblGrid>
+      <w:tr>
+        <w:trPr>
+          <w:cnfStyle w:val="100000000000" w:firstRow="1" w:lastRow="0" w:firstColumn="0" w:lastColumn="0" w:oddVBand="0" w:evenVBand="0" w:oddHBand="0" w:evenHBand="0" w:firstRowFirstColumn="0" w:firstRowLastColumn="0" w:lastRowFirstColumn="0" w:lastRowLastColumn="0"/>
+        </w:trPr>
+        <w:tc>
+          <w:tcPr>
+            <w:cnfStyle w:val="001000000000" w:firstRow="0" w:lastRow="0" w:firstColumn="1" w:lastColumn="0" w:oddVBand="0" w:evenVBand="0" w:oddHBand="0" w:evenHBand="0" w:firstRowFirstColumn="0" w:firstRowLastColumn="0" w:lastRowFirstColumn="0" w:lastRowLastColumn="0"/>
+            <w:tcW w:w="2482" w:type="dxa"/>
+          </w:tcPr>
+          <w:p>
+            <w:pPr>
+              <w:jc w:val="center"/>
+              <w:rPr>
+                <w:rFonts w:ascii="Arial" w:hAnsi="Arial" w:cs="Arial"/>
+                <w:b w:val="0"/>
+                <w:bCs w:val="0"/>
+              </w:rPr>
+            </w:pPr>
+            <w:r>
+              <w:rPr>
+                <w:rFonts w:ascii="Arial" w:hAnsi="Arial" w:cs="Arial"/>
+              </w:rPr>
+              <w:t>Field</w:t>
+            </w:r>
+          </w:p>
+        </w:tc>
+        <w:tc>
+          <w:tcPr>
+            <w:tcW w:w="2259" w:type="dxa"/>
+          </w:tcPr>
+          <w:p>
+            <w:pPr>
+              <w:jc w:val="center"/>
+              <w:cnfStyle w:val="100000000000" w:firstRow="1" w:lastRow="0" w:firstColumn="0" w:lastColumn="0" w:oddVBand="0" w:evenVBand="0" w:oddHBand="0" w:evenHBand="0" w:firstRowFirstColumn="0" w:firstRowLastColumn="0" w:lastRowFirstColumn="0" w:lastRowLastColumn="0"/>
+              <w:rPr>
+                <w:rFonts w:ascii="Arial" w:hAnsi="Arial" w:cs="Arial"/>
+                <w:b w:val="0"/>
+                <w:bCs w:val="0"/>
+              </w:rPr>
+            </w:pPr>
+            <w:r>
+              <w:rPr>
+                <w:rFonts w:ascii="Arial" w:hAnsi="Arial" w:cs="Arial"/>
+              </w:rPr>
+              <w:t>Data Type</w:t>
+            </w:r>
+          </w:p>
+        </w:tc>
+        <w:tc>
+          <w:tcPr>
+            <w:tcW w:w="2283" w:type="dxa"/>
+          </w:tcPr>
+          <w:p>
+            <w:pPr>
+              <w:jc w:val="center"/>
+              <w:cnfStyle w:val="100000000000" w:firstRow="1" w:lastRow="0" w:firstColumn="0" w:lastColumn="0" w:oddVBand="0" w:evenVBand="0" w:oddHBand="0" w:evenHBand="0" w:firstRowFirstColumn="0" w:firstRowLastColumn="0" w:lastRowFirstColumn="0" w:lastRowLastColumn="0"/>
+              <w:rPr>
+                <w:rFonts w:ascii="Arial" w:hAnsi="Arial" w:cs="Arial"/>
+                <w:b w:val="0"/>
+                <w:bCs w:val="0"/>
+              </w:rPr>
+            </w:pPr>
+            <w:r>
+              <w:rPr>
+                <w:rFonts w:ascii="Arial" w:hAnsi="Arial" w:cs="Arial"/>
+              </w:rPr>
+              <w:t>Required</w:t>
+            </w:r>
+          </w:p>
+        </w:tc>
+        <w:tc>
+          <w:tcPr>
+            <w:tcW w:w="2326" w:type="dxa"/>
+          </w:tcPr>
+          <w:p>
+            <w:pPr>
+              <w:jc w:val="center"/>
+              <w:cnfStyle w:val="100000000000" w:firstRow="1" w:lastRow="0" w:firstColumn="0" w:lastColumn="0" w:oddVBand="0" w:evenVBand="0" w:oddHBand="0" w:evenHBand="0" w:firstRowFirstColumn="0" w:firstRowLastColumn="0" w:lastRowFirstColumn="0" w:lastRowLastColumn="0"/>
+              <w:rPr>
+                <w:rFonts w:ascii="Arial" w:hAnsi="Arial" w:cs="Arial"/>
+                <w:b w:val="0"/>
+                <w:bCs w:val="0"/>
+              </w:rPr>
+            </w:pPr>
+            <w:r>
+              <w:rPr>
+                <w:rFonts w:ascii="Arial" w:hAnsi="Arial" w:cs="Arial"/>
+              </w:rPr>
+              <w:t>Description</w:t>
+            </w:r>
+          </w:p>
+        </w:tc>
+      </w:tr>
+      <w:tr>
+        <w:trPr>
+          <w:cnfStyle w:val="000000100000" w:firstRow="0" w:lastRow="0" w:firstColumn="0" w:lastColumn="0" w:oddVBand="0" w:evenVBand="0" w:oddHBand="1" w:evenHBand="0" w:firstRowFirstColumn="0" w:firstRowLastColumn="0" w:lastRowFirstColumn="0" w:lastRowLastColumn="0"/>
+        </w:trPr>
+        <w:tc>
+          <w:tcPr>
+            <w:cnfStyle w:val="001000000000" w:firstRow="0" w:lastRow="0" w:firstColumn="1" w:lastColumn="0" w:oddVBand="0" w:evenVBand="0" w:oddHBand="0" w:evenHBand="0" w:firstRowFirstColumn="0" w:firstRowLastColumn="0" w:lastRowFirstColumn="0" w:lastRowLastColumn="0"/>
+            <w:tcW w:w="2482" w:type="dxa"/>
+          </w:tcPr>
+          <w:p>
+            <w:pPr>
+              <w:rPr>
+                <w:rFonts w:ascii="Arial" w:hAnsi="Arial" w:cs="Arial"/>
+                <w:b w:val="0"/>
+                <w:bCs w:val="0"/>
+                <w:sz w:val="22"/>
+                <w:szCs w:val="22"/>
+              </w:rPr>
+            </w:pPr>
+            <w:proofErr w:type="spellStart"/>
+            <w:r>
+              <w:rPr>
+                <w:rFonts w:ascii="Arial" w:hAnsi="Arial" w:cs="Arial"/>
+                <w:sz w:val="22"/>
+                <w:szCs w:val="22"/>
+              </w:rPr>
+              <w:t>sessionToken</w:t>
+            </w:r>
+            <w:proofErr w:type="spellEnd"/>
+          </w:p>
+        </w:tc>
+        <w:tc>
+          <w:tcPr>
+            <w:tcW w:w="2259" w:type="dxa"/>
+          </w:tcPr>
+          <w:p>
+            <w:pPr>
+              <w:cnfStyle w:val="000000100000" w:firstRow="0" w:lastRow="0" w:firstColumn="0" w:lastColumn="0" w:oddVBand="0" w:evenVBand="0" w:oddHBand="1" w:evenHBand="0" w:firstRowFirstColumn="0" w:firstRowLastColumn="0" w:lastRowFirstColumn="0" w:lastRowLastColumn="0"/>
+              <w:rPr>
+                <w:rFonts w:ascii="Arial" w:hAnsi="Arial" w:cs="Arial"/>
+                <w:sz w:val="22"/>
+                <w:szCs w:val="22"/>
+              </w:rPr>
+            </w:pPr>
+            <w:r>
+              <w:rPr>
+                <w:rFonts w:ascii="Arial" w:hAnsi="Arial" w:cs="Arial"/>
+                <w:sz w:val="22"/>
+                <w:szCs w:val="22"/>
+              </w:rPr>
+              <w:t>String</w:t>
+            </w:r>
+          </w:p>
+        </w:tc>
+        <w:tc>
+          <w:tcPr>
+            <w:tcW w:w="2283" w:type="dxa"/>
+          </w:tcPr>
+          <w:p>
+            <w:pPr>
+              <w:cnfStyle w:val="000000100000" w:firstRow="0" w:lastRow="0" w:firstColumn="0" w:lastColumn="0" w:oddVBand="0" w:evenVBand="0" w:oddHBand="1" w:evenHBand="0" w:firstRowFirstColumn="0" w:firstRowLastColumn="0" w:lastRowFirstColumn="0" w:lastRowLastColumn="0"/>
+              <w:rPr>
+                <w:rFonts w:ascii="Arial" w:hAnsi="Arial" w:cs="Arial"/>
+                <w:sz w:val="22"/>
+                <w:szCs w:val="22"/>
+              </w:rPr>
+            </w:pPr>
+            <w:r>
+              <w:rPr>
+                <w:rFonts w:ascii="Arial" w:hAnsi="Arial" w:cs="Arial"/>
+                <w:sz w:val="22"/>
+                <w:szCs w:val="22"/>
+              </w:rPr>
+              <w:t>Yes</w:t>
+            </w:r>
+          </w:p>
+        </w:tc>
+        <w:tc>
+          <w:tcPr>
+            <w:tcW w:w="2326" w:type="dxa"/>
+          </w:tcPr>
+          <w:p>
+            <w:pPr>
+              <w:cnfStyle w:val="000000100000" w:firstRow="0" w:lastRow="0" w:firstColumn="0" w:lastColumn="0" w:oddVBand="0" w:evenVBand="0" w:oddHBand="1" w:evenHBand="0" w:firstRowFirstColumn="0" w:firstRowLastColumn="0" w:lastRowFirstColumn="0" w:lastRowLastColumn="0"/>
+              <w:rPr>
+                <w:rFonts w:ascii="Arial" w:hAnsi="Arial" w:cs="Arial"/>
+                <w:sz w:val="22"/>
+                <w:szCs w:val="22"/>
+              </w:rPr>
+            </w:pPr>
+            <w:r>
+              <w:rPr>
+                <w:rFonts w:ascii="Arial" w:hAnsi="Arial" w:cs="Arial"/>
+                <w:sz w:val="22"/>
+                <w:szCs w:val="22"/>
+              </w:rPr>
+              <w:t xml:space="preserve">The active session </w:t>
+            </w:r>
+            <w:proofErr w:type="gramStart"/>
+            <w:r>
+              <w:rPr>
+                <w:rFonts w:ascii="Arial" w:hAnsi="Arial" w:cs="Arial"/>
+                <w:sz w:val="22"/>
+                <w:szCs w:val="22"/>
+              </w:rPr>
+              <w:t>token</w:t>
+            </w:r>
+            <w:proofErr w:type="gramEnd"/>
+            <w:r>
+              <w:rPr>
+                <w:rFonts w:ascii="Arial" w:hAnsi="Arial" w:cs="Arial"/>
+                <w:sz w:val="22"/>
+                <w:szCs w:val="22"/>
+              </w:rPr>
+              <w:t xml:space="preserve"> to be validated by the system.</w:t>
+            </w:r>
+          </w:p>
+        </w:tc>
+      </w:tr>
+      <w:tr>
+        <w:tc>
+          <w:tcPr>
+            <w:cnfStyle w:val="001000000000" w:firstRow="0" w:lastRow="0" w:firstColumn="1" w:lastColumn="0" w:oddVBand="0" w:evenVBand="0" w:oddHBand="0" w:evenHBand="0" w:firstRowFirstColumn="0" w:firstRowLastColumn="0" w:lastRowFirstColumn="0" w:lastRowLastColumn="0"/>
+            <w:tcW w:w="2482" w:type="dxa"/>
+          </w:tcPr>
+          <w:p>
+            <w:pPr>
+              <w:rPr>
+                <w:rFonts w:ascii="Arial" w:hAnsi="Arial" w:cs="Arial"/>
+                <w:b w:val="0"/>
+                <w:bCs w:val="0"/>
+                <w:sz w:val="22"/>
+                <w:szCs w:val="22"/>
+              </w:rPr>
+            </w:pPr>
+            <w:proofErr w:type="spellStart"/>
+            <w:r>
+              <w:rPr>
+                <w:rFonts w:ascii="Arial" w:hAnsi="Arial" w:cs="Arial"/>
+                <w:sz w:val="22"/>
+                <w:szCs w:val="22"/>
+              </w:rPr>
+              <w:t>resourcePath</w:t>
+            </w:r>
+            <w:proofErr w:type="spellEnd"/>
+          </w:p>
+        </w:tc>
+        <w:tc>
+          <w:tcPr>
+            <w:tcW w:w="2259" w:type="dxa"/>
+          </w:tcPr>
+          <w:p>
+            <w:pPr>
+              <w:cnfStyle w:val="000000000000" w:firstRow="0" w:lastRow="0" w:firstColumn="0" w:lastColumn="0" w:oddVBand="0" w:evenVBand="0" w:oddHBand="0" w:evenHBand="0" w:firstRowFirstColumn="0" w:firstRowLastColumn="0" w:lastRowFirstColumn="0" w:lastRowLastColumn="0"/>
+              <w:rPr>
+                <w:rFonts w:ascii="Arial" w:hAnsi="Arial" w:cs="Arial"/>
+                <w:sz w:val="22"/>
+                <w:szCs w:val="22"/>
+              </w:rPr>
+            </w:pPr>
+            <w:r>
+              <w:rPr>
+                <w:rFonts w:ascii="Arial" w:hAnsi="Arial" w:cs="Arial"/>
+                <w:sz w:val="22"/>
+                <w:szCs w:val="22"/>
+              </w:rPr>
+              <w:t>String</w:t>
+            </w:r>
+          </w:p>
+        </w:tc>
+        <w:tc>
+          <w:tcPr>
+            <w:tcW w:w="2283" w:type="dxa"/>
+          </w:tcPr>
+          <w:p>
+            <w:pPr>
+              <w:cnfStyle w:val="000000000000" w:firstRow="0" w:lastRow="0" w:firstColumn="0" w:lastColumn="0" w:oddVBand="0" w:evenVBand="0" w:oddHBand="0" w:evenHBand="0" w:firstRowFirstColumn="0" w:firstRowLastColumn="0" w:lastRowFirstColumn="0" w:lastRowLastColumn="0"/>
+              <w:rPr>
+                <w:rFonts w:ascii="Arial" w:hAnsi="Arial" w:cs="Arial"/>
+                <w:sz w:val="22"/>
+                <w:szCs w:val="22"/>
+              </w:rPr>
+            </w:pPr>
+            <w:r>
+              <w:rPr>
+                <w:rFonts w:ascii="Arial" w:hAnsi="Arial" w:cs="Arial"/>
+                <w:sz w:val="22"/>
+                <w:szCs w:val="22"/>
+              </w:rPr>
+              <w:t>No</w:t>
+            </w:r>
+          </w:p>
+        </w:tc>
+        <w:tc>
+          <w:tcPr>
+            <w:tcW w:w="2326" w:type="dxa"/>
+          </w:tcPr>
+          <w:p>
+            <w:pPr>
+              <w:cnfStyle w:val="000000000000" w:firstRow="0" w:lastRow="0" w:firstColumn="0" w:lastColumn="0" w:oddVBand="0" w:evenVBand="0" w:oddHBand="0" w:evenHBand="0" w:firstRowFirstColumn="0" w:firstRowLastColumn="0" w:lastRowFirstColumn="0" w:lastRowLastColumn="0"/>
+              <w:rPr>
+                <w:rFonts w:ascii="Arial" w:hAnsi="Arial" w:cs="Arial"/>
+                <w:sz w:val="22"/>
+                <w:szCs w:val="22"/>
+              </w:rPr>
+            </w:pPr>
+            <w:r>
+              <w:rPr>
+                <w:rFonts w:ascii="Arial" w:hAnsi="Arial" w:cs="Arial"/>
+                <w:sz w:val="22"/>
+                <w:szCs w:val="22"/>
+              </w:rPr>
+              <w:t>The specific protected API route or resource the user is attempting to access.</w:t>
+            </w:r>
+          </w:p>
+        </w:tc>
+      </w:tr>
+    </w:tbl>
     <w:p>
       <w:pPr>
         <w:outlineLvl w:val="2"/>
@@ -3290,19 +3632,464 @@
       </w:r>
       <w:proofErr w:type="spellEnd"/>
     </w:p>
-    <w:p>
-      <w:pPr>
-        <w:rPr>
-          <w:rFonts w:ascii="Arial" w:hAnsi="Arial" w:cs="Arial"/>
-        </w:rPr>
-      </w:pPr>
-      <w:r>
-        <w:rPr>
-          <w:rFonts w:ascii="Arial" w:hAnsi="Arial" w:cs="Arial"/>
-        </w:rPr>
-        <w:t>[Table Pending]</w:t>
-      </w:r>
-    </w:p>
+    <w:tbl>
+      <w:tblPr>
+        <w:tblStyle w:val="GridTable4"/>
+        <w:tblW w:w="0" w:type="auto"/>
+        <w:tblLook w:val="04A0" w:firstRow="1" w:lastRow="0" w:firstColumn="1" w:lastColumn="0" w:noHBand="0" w:noVBand="1"/>
+      </w:tblPr>
+      <w:tblGrid>
+        <w:gridCol w:w="2482"/>
+        <w:gridCol w:w="2259"/>
+        <w:gridCol w:w="2283"/>
+        <w:gridCol w:w="2326"/>
+      </w:tblGrid>
+      <w:tr>
+        <w:trPr>
+          <w:cnfStyle w:val="100000000000" w:firstRow="1" w:lastRow="0" w:firstColumn="0" w:lastColumn="0" w:oddVBand="0" w:evenVBand="0" w:oddHBand="0" w:evenHBand="0" w:firstRowFirstColumn="0" w:firstRowLastColumn="0" w:lastRowFirstColumn="0" w:lastRowLastColumn="0"/>
+        </w:trPr>
+        <w:tc>
+          <w:tcPr>
+            <w:cnfStyle w:val="001000000000" w:firstRow="0" w:lastRow="0" w:firstColumn="1" w:lastColumn="0" w:oddVBand="0" w:evenVBand="0" w:oddHBand="0" w:evenHBand="0" w:firstRowFirstColumn="0" w:firstRowLastColumn="0" w:lastRowFirstColumn="0" w:lastRowLastColumn="0"/>
+            <w:tcW w:w="2482" w:type="dxa"/>
+          </w:tcPr>
+          <w:p>
+            <w:pPr>
+              <w:jc w:val="center"/>
+              <w:rPr>
+                <w:rFonts w:ascii="Arial" w:hAnsi="Arial" w:cs="Arial"/>
+                <w:b w:val="0"/>
+                <w:bCs w:val="0"/>
+              </w:rPr>
+            </w:pPr>
+            <w:r>
+              <w:rPr>
+                <w:rFonts w:ascii="Arial" w:hAnsi="Arial" w:cs="Arial"/>
+              </w:rPr>
+              <w:t>Field</w:t>
+            </w:r>
+          </w:p>
+        </w:tc>
+        <w:tc>
+          <w:tcPr>
+            <w:tcW w:w="2259" w:type="dxa"/>
+          </w:tcPr>
+          <w:p>
+            <w:pPr>
+              <w:jc w:val="center"/>
+              <w:cnfStyle w:val="100000000000" w:firstRow="1" w:lastRow="0" w:firstColumn="0" w:lastColumn="0" w:oddVBand="0" w:evenVBand="0" w:oddHBand="0" w:evenHBand="0" w:firstRowFirstColumn="0" w:firstRowLastColumn="0" w:lastRowFirstColumn="0" w:lastRowLastColumn="0"/>
+              <w:rPr>
+                <w:rFonts w:ascii="Arial" w:hAnsi="Arial" w:cs="Arial"/>
+                <w:b w:val="0"/>
+                <w:bCs w:val="0"/>
+              </w:rPr>
+            </w:pPr>
+            <w:r>
+              <w:rPr>
+                <w:rFonts w:ascii="Arial" w:hAnsi="Arial" w:cs="Arial"/>
+              </w:rPr>
+              <w:t>Data Type</w:t>
+            </w:r>
+          </w:p>
+        </w:tc>
+        <w:tc>
+          <w:tcPr>
+            <w:tcW w:w="2283" w:type="dxa"/>
+          </w:tcPr>
+          <w:p>
+            <w:pPr>
+              <w:jc w:val="center"/>
+              <w:cnfStyle w:val="100000000000" w:firstRow="1" w:lastRow="0" w:firstColumn="0" w:lastColumn="0" w:oddVBand="0" w:evenVBand="0" w:oddHBand="0" w:evenHBand="0" w:firstRowFirstColumn="0" w:firstRowLastColumn="0" w:lastRowFirstColumn="0" w:lastRowLastColumn="0"/>
+              <w:rPr>
+                <w:rFonts w:ascii="Arial" w:hAnsi="Arial" w:cs="Arial"/>
+                <w:b w:val="0"/>
+                <w:bCs w:val="0"/>
+              </w:rPr>
+            </w:pPr>
+            <w:r>
+              <w:rPr>
+                <w:rFonts w:ascii="Arial" w:hAnsi="Arial" w:cs="Arial"/>
+              </w:rPr>
+              <w:t>Required</w:t>
+            </w:r>
+          </w:p>
+        </w:tc>
+        <w:tc>
+          <w:tcPr>
+            <w:tcW w:w="2326" w:type="dxa"/>
+          </w:tcPr>
+          <w:p>
+            <w:pPr>
+              <w:jc w:val="center"/>
+              <w:cnfStyle w:val="100000000000" w:firstRow="1" w:lastRow="0" w:firstColumn="0" w:lastColumn="0" w:oddVBand="0" w:evenVBand="0" w:oddHBand="0" w:evenHBand="0" w:firstRowFirstColumn="0" w:firstRowLastColumn="0" w:lastRowFirstColumn="0" w:lastRowLastColumn="0"/>
+              <w:rPr>
+                <w:rFonts w:ascii="Arial" w:hAnsi="Arial" w:cs="Arial"/>
+                <w:b w:val="0"/>
+                <w:bCs w:val="0"/>
+              </w:rPr>
+            </w:pPr>
+            <w:r>
+              <w:rPr>
+                <w:rFonts w:ascii="Arial" w:hAnsi="Arial" w:cs="Arial"/>
+              </w:rPr>
+              <w:t>Description</w:t>
+            </w:r>
+          </w:p>
+        </w:tc>
+      </w:tr>
+      <w:tr>
+        <w:trPr>
+          <w:cnfStyle w:val="000000100000" w:firstRow="0" w:lastRow="0" w:firstColumn="0" w:lastColumn="0" w:oddVBand="0" w:evenVBand="0" w:oddHBand="1" w:evenHBand="0" w:firstRowFirstColumn="0" w:firstRowLastColumn="0" w:lastRowFirstColumn="0" w:lastRowLastColumn="0"/>
+        </w:trPr>
+        <w:tc>
+          <w:tcPr>
+            <w:cnfStyle w:val="001000000000" w:firstRow="0" w:lastRow="0" w:firstColumn="1" w:lastColumn="0" w:oddVBand="0" w:evenVBand="0" w:oddHBand="0" w:evenHBand="0" w:firstRowFirstColumn="0" w:firstRowLastColumn="0" w:lastRowFirstColumn="0" w:lastRowLastColumn="0"/>
+            <w:tcW w:w="2482" w:type="dxa"/>
+          </w:tcPr>
+          <w:p>
+            <w:pPr>
+              <w:rPr>
+                <w:rFonts w:ascii="Arial" w:hAnsi="Arial" w:cs="Arial"/>
+                <w:b w:val="0"/>
+                <w:bCs w:val="0"/>
+                <w:sz w:val="22"/>
+                <w:szCs w:val="22"/>
+              </w:rPr>
+            </w:pPr>
+            <w:proofErr w:type="spellStart"/>
+            <w:r>
+              <w:rPr>
+                <w:rFonts w:ascii="Arial" w:hAnsi="Arial" w:cs="Arial"/>
+                <w:sz w:val="22"/>
+                <w:szCs w:val="22"/>
+              </w:rPr>
+              <w:t>isValid</w:t>
+            </w:r>
+            <w:proofErr w:type="spellEnd"/>
+          </w:p>
+        </w:tc>
+        <w:tc>
+          <w:tcPr>
+            <w:tcW w:w="2259" w:type="dxa"/>
+          </w:tcPr>
+          <w:p>
+            <w:pPr>
+              <w:cnfStyle w:val="000000100000" w:firstRow="0" w:lastRow="0" w:firstColumn="0" w:lastColumn="0" w:oddVBand="0" w:evenVBand="0" w:oddHBand="1" w:evenHBand="0" w:firstRowFirstColumn="0" w:firstRowLastColumn="0" w:lastRowFirstColumn="0" w:lastRowLastColumn="0"/>
+              <w:rPr>
+                <w:rFonts w:ascii="Arial" w:hAnsi="Arial" w:cs="Arial"/>
+                <w:sz w:val="22"/>
+                <w:szCs w:val="22"/>
+              </w:rPr>
+            </w:pPr>
+            <w:r>
+              <w:rPr>
+                <w:rFonts w:ascii="Arial" w:hAnsi="Arial" w:cs="Arial"/>
+                <w:sz w:val="22"/>
+                <w:szCs w:val="22"/>
+              </w:rPr>
+              <w:t>Boolean</w:t>
+            </w:r>
+          </w:p>
+        </w:tc>
+        <w:tc>
+          <w:tcPr>
+            <w:tcW w:w="2283" w:type="dxa"/>
+          </w:tcPr>
+          <w:p>
+            <w:pPr>
+              <w:cnfStyle w:val="000000100000" w:firstRow="0" w:lastRow="0" w:firstColumn="0" w:lastColumn="0" w:oddVBand="0" w:evenVBand="0" w:oddHBand="1" w:evenHBand="0" w:firstRowFirstColumn="0" w:firstRowLastColumn="0" w:lastRowFirstColumn="0" w:lastRowLastColumn="0"/>
+              <w:rPr>
+                <w:rFonts w:ascii="Arial" w:hAnsi="Arial" w:cs="Arial"/>
+                <w:sz w:val="22"/>
+                <w:szCs w:val="22"/>
+              </w:rPr>
+            </w:pPr>
+            <w:r>
+              <w:rPr>
+                <w:rFonts w:ascii="Arial" w:hAnsi="Arial" w:cs="Arial"/>
+                <w:sz w:val="22"/>
+                <w:szCs w:val="22"/>
+              </w:rPr>
+              <w:t>Yes</w:t>
+            </w:r>
+          </w:p>
+        </w:tc>
+        <w:tc>
+          <w:tcPr>
+            <w:tcW w:w="2326" w:type="dxa"/>
+          </w:tcPr>
+          <w:p>
+            <w:pPr>
+              <w:cnfStyle w:val="000000100000" w:firstRow="0" w:lastRow="0" w:firstColumn="0" w:lastColumn="0" w:oddVBand="0" w:evenVBand="0" w:oddHBand="1" w:evenHBand="0" w:firstRowFirstColumn="0" w:firstRowLastColumn="0" w:lastRowFirstColumn="0" w:lastRowLastColumn="0"/>
+              <w:rPr>
+                <w:rFonts w:ascii="Arial" w:hAnsi="Arial" w:cs="Arial"/>
+                <w:sz w:val="22"/>
+                <w:szCs w:val="22"/>
+              </w:rPr>
+            </w:pPr>
+            <w:r>
+              <w:rPr>
+                <w:rFonts w:ascii="Arial" w:hAnsi="Arial" w:cs="Arial"/>
+                <w:sz w:val="22"/>
+                <w:szCs w:val="22"/>
+              </w:rPr>
+              <w:t xml:space="preserve">Indicates whether the </w:t>
+            </w:r>
+            <w:proofErr w:type="gramStart"/>
+            <w:r>
+              <w:rPr>
+                <w:rFonts w:ascii="Arial" w:hAnsi="Arial" w:cs="Arial"/>
+                <w:sz w:val="22"/>
+                <w:szCs w:val="22"/>
+              </w:rPr>
+              <w:t>provided session token</w:t>
+            </w:r>
+            <w:proofErr w:type="gramEnd"/>
+            <w:r>
+              <w:rPr>
+                <w:rFonts w:ascii="Arial" w:hAnsi="Arial" w:cs="Arial"/>
+                <w:sz w:val="22"/>
+                <w:szCs w:val="22"/>
+              </w:rPr>
+              <w:t xml:space="preserve"> is valid, active, and not expired.</w:t>
+            </w:r>
+          </w:p>
+        </w:tc>
+      </w:tr>
+      <w:tr>
+        <w:tc>
+          <w:tcPr>
+            <w:cnfStyle w:val="001000000000" w:firstRow="0" w:lastRow="0" w:firstColumn="1" w:lastColumn="0" w:oddVBand="0" w:evenVBand="0" w:oddHBand="0" w:evenHBand="0" w:firstRowFirstColumn="0" w:firstRowLastColumn="0" w:lastRowFirstColumn="0" w:lastRowLastColumn="0"/>
+            <w:tcW w:w="2482" w:type="dxa"/>
+          </w:tcPr>
+          <w:p>
+            <w:pPr>
+              <w:rPr>
+                <w:rFonts w:ascii="Arial" w:hAnsi="Arial" w:cs="Arial"/>
+                <w:b w:val="0"/>
+                <w:bCs w:val="0"/>
+                <w:sz w:val="22"/>
+                <w:szCs w:val="22"/>
+              </w:rPr>
+            </w:pPr>
+            <w:r>
+              <w:rPr>
+                <w:rFonts w:ascii="Arial" w:hAnsi="Arial" w:cs="Arial"/>
+                <w:sz w:val="22"/>
+                <w:szCs w:val="22"/>
+              </w:rPr>
+              <w:t>role</w:t>
+            </w:r>
+          </w:p>
+        </w:tc>
+        <w:tc>
+          <w:tcPr>
+            <w:tcW w:w="2259" w:type="dxa"/>
+          </w:tcPr>
+          <w:p>
+            <w:pPr>
+              <w:cnfStyle w:val="000000000000" w:firstRow="0" w:lastRow="0" w:firstColumn="0" w:lastColumn="0" w:oddVBand="0" w:evenVBand="0" w:oddHBand="0" w:evenHBand="0" w:firstRowFirstColumn="0" w:firstRowLastColumn="0" w:lastRowFirstColumn="0" w:lastRowLastColumn="0"/>
+              <w:rPr>
+                <w:rFonts w:ascii="Arial" w:hAnsi="Arial" w:cs="Arial"/>
+                <w:sz w:val="22"/>
+                <w:szCs w:val="22"/>
+              </w:rPr>
+            </w:pPr>
+            <w:r>
+              <w:rPr>
+                <w:rFonts w:ascii="Arial" w:hAnsi="Arial" w:cs="Arial"/>
+                <w:sz w:val="22"/>
+                <w:szCs w:val="22"/>
+              </w:rPr>
+              <w:t>String</w:t>
+            </w:r>
+          </w:p>
+        </w:tc>
+        <w:tc>
+          <w:tcPr>
+            <w:tcW w:w="2283" w:type="dxa"/>
+          </w:tcPr>
+          <w:p>
+            <w:pPr>
+              <w:cnfStyle w:val="000000000000" w:firstRow="0" w:lastRow="0" w:firstColumn="0" w:lastColumn="0" w:oddVBand="0" w:evenVBand="0" w:oddHBand="0" w:evenHBand="0" w:firstRowFirstColumn="0" w:firstRowLastColumn="0" w:lastRowFirstColumn="0" w:lastRowLastColumn="0"/>
+              <w:rPr>
+                <w:rFonts w:ascii="Arial" w:hAnsi="Arial" w:cs="Arial"/>
+                <w:sz w:val="22"/>
+                <w:szCs w:val="22"/>
+              </w:rPr>
+            </w:pPr>
+            <w:r>
+              <w:rPr>
+                <w:rFonts w:ascii="Arial" w:hAnsi="Arial" w:cs="Arial"/>
+                <w:sz w:val="22"/>
+                <w:szCs w:val="22"/>
+              </w:rPr>
+              <w:t>Yes</w:t>
+            </w:r>
+          </w:p>
+        </w:tc>
+        <w:tc>
+          <w:tcPr>
+            <w:tcW w:w="2326" w:type="dxa"/>
+          </w:tcPr>
+          <w:p>
+            <w:pPr>
+              <w:cnfStyle w:val="000000000000" w:firstRow="0" w:lastRow="0" w:firstColumn="0" w:lastColumn="0" w:oddVBand="0" w:evenVBand="0" w:oddHBand="0" w:evenHBand="0" w:firstRowFirstColumn="0" w:firstRowLastColumn="0" w:lastRowFirstColumn="0" w:lastRowLastColumn="0"/>
+              <w:rPr>
+                <w:rFonts w:ascii="Arial" w:hAnsi="Arial" w:cs="Arial"/>
+                <w:sz w:val="22"/>
+                <w:szCs w:val="22"/>
+              </w:rPr>
+            </w:pPr>
+            <w:r>
+              <w:rPr>
+                <w:rFonts w:ascii="Arial" w:hAnsi="Arial" w:cs="Arial"/>
+                <w:sz w:val="22"/>
+                <w:szCs w:val="22"/>
+              </w:rPr>
+              <w:t xml:space="preserve">The specific role </w:t>
+            </w:r>
+            <w:proofErr w:type="gramStart"/>
+            <w:r>
+              <w:rPr>
+                <w:rFonts w:ascii="Arial" w:hAnsi="Arial" w:cs="Arial"/>
+                <w:sz w:val="22"/>
+                <w:szCs w:val="22"/>
+              </w:rPr>
+              <w:t>attached</w:t>
+            </w:r>
+            <w:proofErr w:type="gramEnd"/>
+            <w:r>
+              <w:rPr>
+                <w:rFonts w:ascii="Arial" w:hAnsi="Arial" w:cs="Arial"/>
+                <w:sz w:val="22"/>
+                <w:szCs w:val="22"/>
+              </w:rPr>
+              <w:t xml:space="preserve"> to the user's account to verify permissions.</w:t>
+            </w:r>
+          </w:p>
+        </w:tc>
+      </w:tr>
+      <w:tr>
+        <w:trPr>
+          <w:cnfStyle w:val="000000100000" w:firstRow="0" w:lastRow="0" w:firstColumn="0" w:lastColumn="0" w:oddVBand="0" w:evenVBand="0" w:oddHBand="1" w:evenHBand="0" w:firstRowFirstColumn="0" w:firstRowLastColumn="0" w:lastRowFirstColumn="0" w:lastRowLastColumn="0"/>
+        </w:trPr>
+        <w:tc>
+          <w:tcPr>
+            <w:cnfStyle w:val="001000000000" w:firstRow="0" w:lastRow="0" w:firstColumn="1" w:lastColumn="0" w:oddVBand="0" w:evenVBand="0" w:oddHBand="0" w:evenHBand="0" w:firstRowFirstColumn="0" w:firstRowLastColumn="0" w:lastRowFirstColumn="0" w:lastRowLastColumn="0"/>
+            <w:tcW w:w="2482" w:type="dxa"/>
+          </w:tcPr>
+          <w:p>
+            <w:pPr>
+              <w:rPr>
+                <w:rFonts w:ascii="Arial" w:hAnsi="Arial" w:cs="Arial"/>
+                <w:b w:val="0"/>
+                <w:bCs w:val="0"/>
+                <w:sz w:val="22"/>
+                <w:szCs w:val="22"/>
+              </w:rPr>
+            </w:pPr>
+            <w:proofErr w:type="spellStart"/>
+            <w:r>
+              <w:rPr>
+                <w:rFonts w:ascii="Arial" w:hAnsi="Arial" w:cs="Arial"/>
+                <w:sz w:val="22"/>
+                <w:szCs w:val="22"/>
+              </w:rPr>
+              <w:t>userId</w:t>
+            </w:r>
+            <w:proofErr w:type="spellEnd"/>
+          </w:p>
+        </w:tc>
+        <w:tc>
+          <w:tcPr>
+            <w:tcW w:w="2259" w:type="dxa"/>
+          </w:tcPr>
+          <w:p>
+            <w:pPr>
+              <w:cnfStyle w:val="000000100000" w:firstRow="0" w:lastRow="0" w:firstColumn="0" w:lastColumn="0" w:oddVBand="0" w:evenVBand="0" w:oddHBand="1" w:evenHBand="0" w:firstRowFirstColumn="0" w:firstRowLastColumn="0" w:lastRowFirstColumn="0" w:lastRowLastColumn="0"/>
+              <w:rPr>
+                <w:rFonts w:ascii="Arial" w:hAnsi="Arial" w:cs="Arial"/>
+                <w:sz w:val="22"/>
+                <w:szCs w:val="22"/>
+              </w:rPr>
+            </w:pPr>
+            <w:r>
+              <w:rPr>
+                <w:rFonts w:ascii="Arial" w:hAnsi="Arial" w:cs="Arial"/>
+                <w:sz w:val="22"/>
+                <w:szCs w:val="22"/>
+              </w:rPr>
+              <w:t>UUID</w:t>
+            </w:r>
+          </w:p>
+        </w:tc>
+        <w:tc>
+          <w:tcPr>
+            <w:tcW w:w="2283" w:type="dxa"/>
+          </w:tcPr>
+          <w:p>
+            <w:pPr>
+              <w:cnfStyle w:val="000000100000" w:firstRow="0" w:lastRow="0" w:firstColumn="0" w:lastColumn="0" w:oddVBand="0" w:evenVBand="0" w:oddHBand="1" w:evenHBand="0" w:firstRowFirstColumn="0" w:firstRowLastColumn="0" w:lastRowFirstColumn="0" w:lastRowLastColumn="0"/>
+              <w:rPr>
+                <w:rFonts w:ascii="Arial" w:hAnsi="Arial" w:cs="Arial"/>
+                <w:sz w:val="22"/>
+                <w:szCs w:val="22"/>
+              </w:rPr>
+            </w:pPr>
+            <w:r>
+              <w:rPr>
+                <w:rFonts w:ascii="Arial" w:hAnsi="Arial" w:cs="Arial"/>
+                <w:sz w:val="22"/>
+                <w:szCs w:val="22"/>
+              </w:rPr>
+              <w:t>Yes</w:t>
+            </w:r>
+          </w:p>
+        </w:tc>
+        <w:tc>
+          <w:tcPr>
+            <w:tcW w:w="2326" w:type="dxa"/>
+          </w:tcPr>
+          <w:p>
+            <w:pPr>
+              <w:cnfStyle w:val="000000100000" w:firstRow="0" w:lastRow="0" w:firstColumn="0" w:lastColumn="0" w:oddVBand="0" w:evenVBand="0" w:oddHBand="1" w:evenHBand="0" w:firstRowFirstColumn="0" w:firstRowLastColumn="0" w:lastRowFirstColumn="0" w:lastRowLastColumn="0"/>
+              <w:rPr>
+                <w:rFonts w:ascii="Arial" w:hAnsi="Arial" w:cs="Arial"/>
+                <w:sz w:val="22"/>
+                <w:szCs w:val="22"/>
+              </w:rPr>
+            </w:pPr>
+            <w:r>
+              <w:rPr>
+                <w:rFonts w:ascii="Arial" w:hAnsi="Arial" w:cs="Arial"/>
+                <w:sz w:val="22"/>
+                <w:szCs w:val="22"/>
+              </w:rPr>
+              <w:t xml:space="preserve">The unique identifier of the user </w:t>
+            </w:r>
+            <w:proofErr w:type="gramStart"/>
+            <w:r>
+              <w:rPr>
+                <w:rFonts w:ascii="Arial" w:hAnsi="Arial" w:cs="Arial"/>
+                <w:sz w:val="22"/>
+                <w:szCs w:val="22"/>
+              </w:rPr>
+              <w:t>associated</w:t>
+            </w:r>
+            <w:proofErr w:type="gramEnd"/>
+            <w:r>
+              <w:rPr>
+                <w:rFonts w:ascii="Arial" w:hAnsi="Arial" w:cs="Arial"/>
+                <w:sz w:val="22"/>
+                <w:szCs w:val="22"/>
+              </w:rPr>
+              <w:t xml:space="preserve"> with the session.</w:t>
+            </w:r>
+          </w:p>
+        </w:tc>
+      </w:tr>
+    </w:tbl>
     <w:p>
       <w:pPr>
         <w:outlineLvl w:val="2"/>
@@ -3390,17 +4177,7 @@
           <w:sz w:val="27"/>
           <w:szCs w:val="27"/>
         </w:rPr>
-        <w:t>Login</w:t>
-      </w:r>
-      <w:r>
-        <w:rPr>
-          <w:rFonts w:ascii="Arial" w:hAnsi="Arial" w:cs="Arial"/>
-          <w:b/>
-          <w:bCs/>
-          <w:sz w:val="27"/>
-          <w:szCs w:val="27"/>
-        </w:rPr>
-        <w:t>Response</w:t>
+        <w:t>LoginResponse</w:t>
       </w:r>
       <w:proofErr w:type="spellEnd"/>
     </w:p>
@@ -3451,19 +4228,214 @@
       </w:r>
       <w:proofErr w:type="spellEnd"/>
     </w:p>
-    <w:p>
-      <w:pPr>
-        <w:rPr>
-          <w:rFonts w:ascii="Arial" w:hAnsi="Arial" w:cs="Arial"/>
-        </w:rPr>
-      </w:pPr>
-      <w:r>
-        <w:rPr>
-          <w:rFonts w:ascii="Arial" w:hAnsi="Arial" w:cs="Arial"/>
-        </w:rPr>
-        <w:t>[Table Pending]</w:t>
-      </w:r>
-    </w:p>
+    <w:tbl>
+      <w:tblPr>
+        <w:tblStyle w:val="GridTable4"/>
+        <w:tblW w:w="0" w:type="auto"/>
+        <w:tblLook w:val="04A0" w:firstRow="1" w:lastRow="0" w:firstColumn="1" w:lastColumn="0" w:noHBand="0" w:noVBand="1"/>
+      </w:tblPr>
+      <w:tblGrid>
+        <w:gridCol w:w="2482"/>
+        <w:gridCol w:w="2259"/>
+        <w:gridCol w:w="2283"/>
+        <w:gridCol w:w="2326"/>
+      </w:tblGrid>
+      <w:tr>
+        <w:trPr>
+          <w:cnfStyle w:val="100000000000" w:firstRow="1" w:lastRow="0" w:firstColumn="0" w:lastColumn="0" w:oddVBand="0" w:evenVBand="0" w:oddHBand="0" w:evenHBand="0" w:firstRowFirstColumn="0" w:firstRowLastColumn="0" w:lastRowFirstColumn="0" w:lastRowLastColumn="0"/>
+        </w:trPr>
+        <w:tc>
+          <w:tcPr>
+            <w:cnfStyle w:val="001000000000" w:firstRow="0" w:lastRow="0" w:firstColumn="1" w:lastColumn="0" w:oddVBand="0" w:evenVBand="0" w:oddHBand="0" w:evenHBand="0" w:firstRowFirstColumn="0" w:firstRowLastColumn="0" w:lastRowFirstColumn="0" w:lastRowLastColumn="0"/>
+            <w:tcW w:w="2482" w:type="dxa"/>
+          </w:tcPr>
+          <w:p>
+            <w:pPr>
+              <w:jc w:val="center"/>
+              <w:rPr>
+                <w:rFonts w:ascii="Arial" w:hAnsi="Arial" w:cs="Arial"/>
+                <w:b w:val="0"/>
+                <w:bCs w:val="0"/>
+              </w:rPr>
+            </w:pPr>
+            <w:r>
+              <w:rPr>
+                <w:rFonts w:ascii="Arial" w:hAnsi="Arial" w:cs="Arial"/>
+              </w:rPr>
+              <w:t>Field</w:t>
+            </w:r>
+          </w:p>
+        </w:tc>
+        <w:tc>
+          <w:tcPr>
+            <w:tcW w:w="2259" w:type="dxa"/>
+          </w:tcPr>
+          <w:p>
+            <w:pPr>
+              <w:jc w:val="center"/>
+              <w:cnfStyle w:val="100000000000" w:firstRow="1" w:lastRow="0" w:firstColumn="0" w:lastColumn="0" w:oddVBand="0" w:evenVBand="0" w:oddHBand="0" w:evenHBand="0" w:firstRowFirstColumn="0" w:firstRowLastColumn="0" w:lastRowFirstColumn="0" w:lastRowLastColumn="0"/>
+              <w:rPr>
+                <w:rFonts w:ascii="Arial" w:hAnsi="Arial" w:cs="Arial"/>
+                <w:b w:val="0"/>
+                <w:bCs w:val="0"/>
+              </w:rPr>
+            </w:pPr>
+            <w:r>
+              <w:rPr>
+                <w:rFonts w:ascii="Arial" w:hAnsi="Arial" w:cs="Arial"/>
+              </w:rPr>
+              <w:t>Data Type</w:t>
+            </w:r>
+          </w:p>
+        </w:tc>
+        <w:tc>
+          <w:tcPr>
+            <w:tcW w:w="2283" w:type="dxa"/>
+          </w:tcPr>
+          <w:p>
+            <w:pPr>
+              <w:jc w:val="center"/>
+              <w:cnfStyle w:val="100000000000" w:firstRow="1" w:lastRow="0" w:firstColumn="0" w:lastColumn="0" w:oddVBand="0" w:evenVBand="0" w:oddHBand="0" w:evenHBand="0" w:firstRowFirstColumn="0" w:firstRowLastColumn="0" w:lastRowFirstColumn="0" w:lastRowLastColumn="0"/>
+              <w:rPr>
+                <w:rFonts w:ascii="Arial" w:hAnsi="Arial" w:cs="Arial"/>
+                <w:b w:val="0"/>
+                <w:bCs w:val="0"/>
+              </w:rPr>
+            </w:pPr>
+            <w:r>
+              <w:rPr>
+                <w:rFonts w:ascii="Arial" w:hAnsi="Arial" w:cs="Arial"/>
+              </w:rPr>
+              <w:t>Required</w:t>
+            </w:r>
+          </w:p>
+        </w:tc>
+        <w:tc>
+          <w:tcPr>
+            <w:tcW w:w="2326" w:type="dxa"/>
+          </w:tcPr>
+          <w:p>
+            <w:pPr>
+              <w:jc w:val="center"/>
+              <w:cnfStyle w:val="100000000000" w:firstRow="1" w:lastRow="0" w:firstColumn="0" w:lastColumn="0" w:oddVBand="0" w:evenVBand="0" w:oddHBand="0" w:evenHBand="0" w:firstRowFirstColumn="0" w:firstRowLastColumn="0" w:lastRowFirstColumn="0" w:lastRowLastColumn="0"/>
+              <w:rPr>
+                <w:rFonts w:ascii="Arial" w:hAnsi="Arial" w:cs="Arial"/>
+                <w:b w:val="0"/>
+                <w:bCs w:val="0"/>
+              </w:rPr>
+            </w:pPr>
+            <w:r>
+              <w:rPr>
+                <w:rFonts w:ascii="Arial" w:hAnsi="Arial" w:cs="Arial"/>
+              </w:rPr>
+              <w:t>Description</w:t>
+            </w:r>
+          </w:p>
+        </w:tc>
+      </w:tr>
+      <w:tr>
+        <w:trPr>
+          <w:cnfStyle w:val="000000100000" w:firstRow="0" w:lastRow="0" w:firstColumn="0" w:lastColumn="0" w:oddVBand="0" w:evenVBand="0" w:oddHBand="1" w:evenHBand="0" w:firstRowFirstColumn="0" w:firstRowLastColumn="0" w:lastRowFirstColumn="0" w:lastRowLastColumn="0"/>
+        </w:trPr>
+        <w:tc>
+          <w:tcPr>
+            <w:cnfStyle w:val="001000000000" w:firstRow="0" w:lastRow="0" w:firstColumn="1" w:lastColumn="0" w:oddVBand="0" w:evenVBand="0" w:oddHBand="0" w:evenHBand="0" w:firstRowFirstColumn="0" w:firstRowLastColumn="0" w:lastRowFirstColumn="0" w:lastRowLastColumn="0"/>
+            <w:tcW w:w="2482" w:type="dxa"/>
+          </w:tcPr>
+          <w:p>
+            <w:pPr>
+              <w:rPr>
+                <w:rFonts w:ascii="Arial" w:hAnsi="Arial" w:cs="Arial"/>
+                <w:b w:val="0"/>
+                <w:bCs w:val="0"/>
+                <w:sz w:val="22"/>
+                <w:szCs w:val="22"/>
+              </w:rPr>
+            </w:pPr>
+            <w:proofErr w:type="spellStart"/>
+            <w:r>
+              <w:rPr>
+                <w:rFonts w:ascii="Arial" w:hAnsi="Arial" w:cs="Arial"/>
+                <w:sz w:val="22"/>
+                <w:szCs w:val="22"/>
+              </w:rPr>
+              <w:lastRenderedPageBreak/>
+              <w:t>sessionToken</w:t>
+            </w:r>
+            <w:proofErr w:type="spellEnd"/>
+          </w:p>
+        </w:tc>
+        <w:tc>
+          <w:tcPr>
+            <w:tcW w:w="2259" w:type="dxa"/>
+          </w:tcPr>
+          <w:p>
+            <w:pPr>
+              <w:cnfStyle w:val="000000100000" w:firstRow="0" w:lastRow="0" w:firstColumn="0" w:lastColumn="0" w:oddVBand="0" w:evenVBand="0" w:oddHBand="1" w:evenHBand="0" w:firstRowFirstColumn="0" w:firstRowLastColumn="0" w:lastRowFirstColumn="0" w:lastRowLastColumn="0"/>
+              <w:rPr>
+                <w:rFonts w:ascii="Arial" w:hAnsi="Arial" w:cs="Arial"/>
+                <w:sz w:val="22"/>
+                <w:szCs w:val="22"/>
+              </w:rPr>
+            </w:pPr>
+            <w:r>
+              <w:rPr>
+                <w:rFonts w:ascii="Arial" w:hAnsi="Arial" w:cs="Arial"/>
+                <w:sz w:val="22"/>
+                <w:szCs w:val="22"/>
+              </w:rPr>
+              <w:t>String</w:t>
+            </w:r>
+          </w:p>
+        </w:tc>
+        <w:tc>
+          <w:tcPr>
+            <w:tcW w:w="2283" w:type="dxa"/>
+          </w:tcPr>
+          <w:p>
+            <w:pPr>
+              <w:cnfStyle w:val="000000100000" w:firstRow="0" w:lastRow="0" w:firstColumn="0" w:lastColumn="0" w:oddVBand="0" w:evenVBand="0" w:oddHBand="1" w:evenHBand="0" w:firstRowFirstColumn="0" w:firstRowLastColumn="0" w:lastRowFirstColumn="0" w:lastRowLastColumn="0"/>
+              <w:rPr>
+                <w:rFonts w:ascii="Arial" w:hAnsi="Arial" w:cs="Arial"/>
+                <w:sz w:val="22"/>
+                <w:szCs w:val="22"/>
+              </w:rPr>
+            </w:pPr>
+            <w:r>
+              <w:rPr>
+                <w:rFonts w:ascii="Arial" w:hAnsi="Arial" w:cs="Arial"/>
+                <w:sz w:val="22"/>
+                <w:szCs w:val="22"/>
+              </w:rPr>
+              <w:t>Yes</w:t>
+            </w:r>
+          </w:p>
+        </w:tc>
+        <w:tc>
+          <w:tcPr>
+            <w:tcW w:w="2326" w:type="dxa"/>
+          </w:tcPr>
+          <w:p>
+            <w:pPr>
+              <w:cnfStyle w:val="000000100000" w:firstRow="0" w:lastRow="0" w:firstColumn="0" w:lastColumn="0" w:oddVBand="0" w:evenVBand="0" w:oddHBand="1" w:evenHBand="0" w:firstRowFirstColumn="0" w:firstRowLastColumn="0" w:lastRowFirstColumn="0" w:lastRowLastColumn="0"/>
+              <w:rPr>
+                <w:rFonts w:ascii="Arial" w:hAnsi="Arial" w:cs="Arial"/>
+                <w:sz w:val="22"/>
+                <w:szCs w:val="22"/>
+              </w:rPr>
+            </w:pPr>
+            <w:r>
+              <w:rPr>
+                <w:rFonts w:ascii="Arial" w:hAnsi="Arial" w:cs="Arial"/>
+                <w:sz w:val="22"/>
+                <w:szCs w:val="22"/>
+              </w:rPr>
+              <w:t>The active session token that needs to be deleted from the device.</w:t>
+            </w:r>
+          </w:p>
+        </w:tc>
+      </w:tr>
+    </w:tbl>
     <w:p>
       <w:pPr>
         <w:outlineLvl w:val="2"/>
@@ -3498,19 +4470,239 @@
       </w:r>
       <w:proofErr w:type="spellEnd"/>
     </w:p>
-    <w:p>
-      <w:pPr>
-        <w:rPr>
-          <w:rFonts w:ascii="Arial" w:hAnsi="Arial" w:cs="Arial"/>
-        </w:rPr>
-      </w:pPr>
-      <w:r>
-        <w:rPr>
-          <w:rFonts w:ascii="Arial" w:hAnsi="Arial" w:cs="Arial"/>
-        </w:rPr>
-        <w:t>[Table Pending]</w:t>
-      </w:r>
-    </w:p>
+    <w:tbl>
+      <w:tblPr>
+        <w:tblStyle w:val="GridTable4"/>
+        <w:tblW w:w="0" w:type="auto"/>
+        <w:tblLook w:val="04A0" w:firstRow="1" w:lastRow="0" w:firstColumn="1" w:lastColumn="0" w:noHBand="0" w:noVBand="1"/>
+      </w:tblPr>
+      <w:tblGrid>
+        <w:gridCol w:w="2482"/>
+        <w:gridCol w:w="2259"/>
+        <w:gridCol w:w="2283"/>
+        <w:gridCol w:w="2326"/>
+      </w:tblGrid>
+      <w:tr>
+        <w:trPr>
+          <w:cnfStyle w:val="100000000000" w:firstRow="1" w:lastRow="0" w:firstColumn="0" w:lastColumn="0" w:oddVBand="0" w:evenVBand="0" w:oddHBand="0" w:evenHBand="0" w:firstRowFirstColumn="0" w:firstRowLastColumn="0" w:lastRowFirstColumn="0" w:lastRowLastColumn="0"/>
+        </w:trPr>
+        <w:tc>
+          <w:tcPr>
+            <w:cnfStyle w:val="001000000000" w:firstRow="0" w:lastRow="0" w:firstColumn="1" w:lastColumn="0" w:oddVBand="0" w:evenVBand="0" w:oddHBand="0" w:evenHBand="0" w:firstRowFirstColumn="0" w:firstRowLastColumn="0" w:lastRowFirstColumn="0" w:lastRowLastColumn="0"/>
+            <w:tcW w:w="2482" w:type="dxa"/>
+          </w:tcPr>
+          <w:p>
+            <w:pPr>
+              <w:jc w:val="center"/>
+              <w:rPr>
+                <w:rFonts w:ascii="Arial" w:hAnsi="Arial" w:cs="Arial"/>
+                <w:b w:val="0"/>
+                <w:bCs w:val="0"/>
+              </w:rPr>
+            </w:pPr>
+            <w:r>
+              <w:rPr>
+                <w:rFonts w:ascii="Arial" w:hAnsi="Arial" w:cs="Arial"/>
+              </w:rPr>
+              <w:t>Field</w:t>
+            </w:r>
+          </w:p>
+        </w:tc>
+        <w:tc>
+          <w:tcPr>
+            <w:tcW w:w="2259" w:type="dxa"/>
+          </w:tcPr>
+          <w:p>
+            <w:pPr>
+              <w:jc w:val="center"/>
+              <w:cnfStyle w:val="100000000000" w:firstRow="1" w:lastRow="0" w:firstColumn="0" w:lastColumn="0" w:oddVBand="0" w:evenVBand="0" w:oddHBand="0" w:evenHBand="0" w:firstRowFirstColumn="0" w:firstRowLastColumn="0" w:lastRowFirstColumn="0" w:lastRowLastColumn="0"/>
+              <w:rPr>
+                <w:rFonts w:ascii="Arial" w:hAnsi="Arial" w:cs="Arial"/>
+                <w:b w:val="0"/>
+                <w:bCs w:val="0"/>
+              </w:rPr>
+            </w:pPr>
+            <w:r>
+              <w:rPr>
+                <w:rFonts w:ascii="Arial" w:hAnsi="Arial" w:cs="Arial"/>
+              </w:rPr>
+              <w:t>Data Type</w:t>
+            </w:r>
+          </w:p>
+        </w:tc>
+        <w:tc>
+          <w:tcPr>
+            <w:tcW w:w="2283" w:type="dxa"/>
+          </w:tcPr>
+          <w:p>
+            <w:pPr>
+              <w:jc w:val="center"/>
+              <w:cnfStyle w:val="100000000000" w:firstRow="1" w:lastRow="0" w:firstColumn="0" w:lastColumn="0" w:oddVBand="0" w:evenVBand="0" w:oddHBand="0" w:evenHBand="0" w:firstRowFirstColumn="0" w:firstRowLastColumn="0" w:lastRowFirstColumn="0" w:lastRowLastColumn="0"/>
+              <w:rPr>
+                <w:rFonts w:ascii="Arial" w:hAnsi="Arial" w:cs="Arial"/>
+                <w:b w:val="0"/>
+                <w:bCs w:val="0"/>
+              </w:rPr>
+            </w:pPr>
+            <w:r>
+              <w:rPr>
+                <w:rFonts w:ascii="Arial" w:hAnsi="Arial" w:cs="Arial"/>
+              </w:rPr>
+              <w:t>Required</w:t>
+            </w:r>
+          </w:p>
+        </w:tc>
+        <w:tc>
+          <w:tcPr>
+            <w:tcW w:w="2326" w:type="dxa"/>
+          </w:tcPr>
+          <w:p>
+            <w:pPr>
+              <w:jc w:val="center"/>
+              <w:cnfStyle w:val="100000000000" w:firstRow="1" w:lastRow="0" w:firstColumn="0" w:lastColumn="0" w:oddVBand="0" w:evenVBand="0" w:oddHBand="0" w:evenHBand="0" w:firstRowFirstColumn="0" w:firstRowLastColumn="0" w:lastRowFirstColumn="0" w:lastRowLastColumn="0"/>
+              <w:rPr>
+                <w:rFonts w:ascii="Arial" w:hAnsi="Arial" w:cs="Arial"/>
+                <w:b w:val="0"/>
+                <w:bCs w:val="0"/>
+              </w:rPr>
+            </w:pPr>
+            <w:r>
+              <w:rPr>
+                <w:rFonts w:ascii="Arial" w:hAnsi="Arial" w:cs="Arial"/>
+              </w:rPr>
+              <w:t>Description</w:t>
+            </w:r>
+          </w:p>
+        </w:tc>
+      </w:tr>
+      <w:tr>
+        <w:trPr>
+          <w:cnfStyle w:val="000000100000" w:firstRow="0" w:lastRow="0" w:firstColumn="0" w:lastColumn="0" w:oddVBand="0" w:evenVBand="0" w:oddHBand="1" w:evenHBand="0" w:firstRowFirstColumn="0" w:firstRowLastColumn="0" w:lastRowFirstColumn="0" w:lastRowLastColumn="0"/>
+        </w:trPr>
+        <w:tc>
+          <w:tcPr>
+            <w:cnfStyle w:val="001000000000" w:firstRow="0" w:lastRow="0" w:firstColumn="1" w:lastColumn="0" w:oddVBand="0" w:evenVBand="0" w:oddHBand="0" w:evenHBand="0" w:firstRowFirstColumn="0" w:firstRowLastColumn="0" w:lastRowFirstColumn="0" w:lastRowLastColumn="0"/>
+            <w:tcW w:w="2482" w:type="dxa"/>
+          </w:tcPr>
+          <w:p>
+            <w:pPr>
+              <w:rPr>
+                <w:rFonts w:ascii="Arial" w:hAnsi="Arial" w:cs="Arial"/>
+                <w:b w:val="0"/>
+                <w:bCs w:val="0"/>
+                <w:sz w:val="22"/>
+                <w:szCs w:val="22"/>
+              </w:rPr>
+            </w:pPr>
+            <w:r>
+              <w:rPr>
+                <w:rFonts w:ascii="Arial" w:hAnsi="Arial" w:cs="Arial"/>
+                <w:sz w:val="22"/>
+                <w:szCs w:val="22"/>
+              </w:rPr>
+              <w:t>success</w:t>
+            </w:r>
+          </w:p>
+        </w:tc>
+        <w:tc>
+          <w:tcPr>
+            <w:tcW w:w="2259" w:type="dxa"/>
+          </w:tcPr>
+          <w:p>
+            <w:pPr>
+              <w:cnfStyle w:val="000000100000" w:firstRow="0" w:lastRow="0" w:firstColumn="0" w:lastColumn="0" w:oddVBand="0" w:evenVBand="0" w:oddHBand="1" w:evenHBand="0" w:firstRowFirstColumn="0" w:firstRowLastColumn="0" w:lastRowFirstColumn="0" w:lastRowLastColumn="0"/>
+              <w:rPr>
+                <w:rFonts w:ascii="Arial" w:hAnsi="Arial" w:cs="Arial"/>
+                <w:sz w:val="22"/>
+                <w:szCs w:val="22"/>
+              </w:rPr>
+            </w:pPr>
+            <w:r>
+              <w:rPr>
+                <w:rFonts w:ascii="Arial" w:hAnsi="Arial" w:cs="Arial"/>
+                <w:sz w:val="22"/>
+                <w:szCs w:val="22"/>
+              </w:rPr>
+              <w:t>Boolean</w:t>
+            </w:r>
+          </w:p>
+        </w:tc>
+        <w:tc>
+          <w:tcPr>
+            <w:tcW w:w="2283" w:type="dxa"/>
+          </w:tcPr>
+          <w:p>
+            <w:pPr>
+              <w:cnfStyle w:val="000000100000" w:firstRow="0" w:lastRow="0" w:firstColumn="0" w:lastColumn="0" w:oddVBand="0" w:evenVBand="0" w:oddHBand="1" w:evenHBand="0" w:firstRowFirstColumn="0" w:firstRowLastColumn="0" w:lastRowFirstColumn="0" w:lastRowLastColumn="0"/>
+              <w:rPr>
+                <w:rFonts w:ascii="Arial" w:hAnsi="Arial" w:cs="Arial"/>
+                <w:sz w:val="22"/>
+                <w:szCs w:val="22"/>
+              </w:rPr>
+            </w:pPr>
+            <w:r>
+              <w:rPr>
+                <w:rFonts w:ascii="Arial" w:hAnsi="Arial" w:cs="Arial"/>
+                <w:sz w:val="22"/>
+                <w:szCs w:val="22"/>
+              </w:rPr>
+              <w:t>Yes</w:t>
+            </w:r>
+          </w:p>
+        </w:tc>
+        <w:tc>
+          <w:tcPr>
+            <w:tcW w:w="2326" w:type="dxa"/>
+          </w:tcPr>
+          <w:p>
+            <w:pPr>
+              <w:cnfStyle w:val="000000100000" w:firstRow="0" w:lastRow="0" w:firstColumn="0" w:lastColumn="0" w:oddVBand="0" w:evenVBand="0" w:oddHBand="1" w:evenHBand="0" w:firstRowFirstColumn="0" w:firstRowLastColumn="0" w:lastRowFirstColumn="0" w:lastRowLastColumn="0"/>
+              <w:rPr>
+                <w:rFonts w:ascii="Arial" w:hAnsi="Arial" w:cs="Arial"/>
+                <w:sz w:val="22"/>
+                <w:szCs w:val="22"/>
+              </w:rPr>
+            </w:pPr>
+            <w:r>
+              <w:rPr>
+                <w:rFonts w:ascii="Arial" w:hAnsi="Arial" w:cs="Arial"/>
+                <w:sz w:val="22"/>
+                <w:szCs w:val="22"/>
+              </w:rPr>
+              <w:t xml:space="preserve">Confirms that the </w:t>
+            </w:r>
+            <w:proofErr w:type="spellStart"/>
+            <w:proofErr w:type="gramStart"/>
+            <w:r>
+              <w:rPr>
+                <w:rFonts w:ascii="Arial" w:hAnsi="Arial" w:cs="Arial"/>
+                <w:sz w:val="22"/>
+                <w:szCs w:val="22"/>
+              </w:rPr>
+              <w:t>logoutUser</w:t>
+            </w:r>
+            <w:proofErr w:type="spellEnd"/>
+            <w:r>
+              <w:rPr>
+                <w:rFonts w:ascii="Arial" w:hAnsi="Arial" w:cs="Arial"/>
+                <w:sz w:val="22"/>
+                <w:szCs w:val="22"/>
+              </w:rPr>
+              <w:t>(</w:t>
+            </w:r>
+            <w:proofErr w:type="gramEnd"/>
+            <w:r>
+              <w:rPr>
+                <w:rFonts w:ascii="Arial" w:hAnsi="Arial" w:cs="Arial"/>
+                <w:sz w:val="22"/>
+                <w:szCs w:val="22"/>
+              </w:rPr>
+              <w:t>) method successfully removed the session.</w:t>
+            </w:r>
+          </w:p>
+        </w:tc>
+      </w:tr>
+    </w:tbl>
     <w:p>
       <w:pPr>
         <w:rPr>

</xml_diff>